<commit_message>
Re-stamp the v2.0.3 QA report
QA report only. No content change: all four corrections were already present
in the previous build and were re-verified in this one. Rebuilt so the
revision timestamp advances and the file carries a distinct hash, removing any
ambiguity about which copy is current.

Timestamp now Tuesday, August 18, 2026 at 10:46 AM CT.

SHA-256 before bbe6651e4096af74bf3f5da4d3c4b2cd9748f36a681f6caf997282b61150f73e
SHA-256 after  09964fc5f58a79b062281f746209e5ae2ef923e6666004ad08ac652a2e0a2c4d

The SOP, SOP preview, PowerPoint and workbook were hashed before and after and
are byte-identical. Package remains CANDIDATE.

Co-Authored-By: Claude Opus 5 <noreply@anthropic.com>
Claude-Session: https://claude.ai/code/session_012Yp4YmLtmKohTs4Kd9CgbL
</commit_message>
<xml_diff>
--- a/free-flagship-assets/60min-v2.0.3/Free_Flagship_60MIN_v2.0.3_Change_Log_and_QA_Report.docx
+++ b/free-flagship-assets/60min-v2.0.3/Free_Flagship_60MIN_v2.0.3_Change_Log_and_QA_Report.docx
@@ -44,7 +44,7 @@
                 <w:color w:val="E3D9C4"/>
                 <w:sz w:val="22"/>
               </w:rPr>
-              <w:t>v2.0.3 CANDIDATE  ·  Revised Monday, August 17, 2026 at 3:51 PM CT</w:t>
+              <w:t>v2.0.3 CANDIDATE  ·  Revised Tuesday, August 18, 2026 at 10:46 AM CT</w:t>
             </w:r>
           </w:p>
         </w:tc>
@@ -66,7 +66,7 @@
           <w:color w:val="B00000"/>
           <w:sz w:val="21"/>
         </w:rPr>
-        <w:t>PRODUCTION REVISION STAMP — Revised Monday, August 17, 2026 at 3:51 PM CT</w:t>
+        <w:t>PRODUCTION REVISION STAMP — Revised Tuesday, August 18, 2026 at 10:46 AM CT</w:t>
       </w:r>
     </w:p>
     <w:p>
@@ -11296,7 +11296,7 @@
           <w:color w:val="555555"/>
           <w:sz w:val="16"/>
         </w:rPr>
-        <w:t>60-MINUTE REBUILD — CHANGE LOG AND QA REPORT v2.0.3  ·  INTERNAL ONLY  ·  Revised Monday, August 17, 2026 at 3:51 PM CT</w:t>
+        <w:t>60-MINUTE REBUILD — CHANGE LOG AND QA REPORT v2.0.3  ·  INTERNAL ONLY  ·  Revised Tuesday, August 18, 2026 at 10:46 AM CT</w:t>
       </w:r>
     </w:p>
     <w:sectPr>

</xml_diff>